<commit_message>
Rett accuracy-avrunding og klasse C-teststørrelse i UPDATED-rapport
- 83,8 % → 83,76 % (linje 456 i md, tilsvarende i docx)
- 109/436 → 108/431 for klasse C test/treningssett (linje 440 i md, tilsvarende i docx)

Co-Authored-By: Claude Sonnet 4.6 <noreply@anthropic.com>
</commit_message>
<xml_diff>
--- a/005 report/Prosjektoppgave_LOG650_G05_FINAL_A_UPDATED.docx
+++ b/005 report/Prosjektoppgave_LOG650_G05_FINAL_A_UPDATED.docx
@@ -18496,7 +18496,7 @@
         <w:t>Stratifisert split:</w:t>
       </w:r>
       <w:r>
-        <w:t xml:space="preserve"> Den stratifiserte 80/20-delingen sikrer at klassefordelingen i testsett og treningssett er representativ for populasjonen. For klasse C (109 observasjoner i testsettet, 436 i treningssettet) er dette særlig viktig: uten stratifisering ville tilfeldig variasjon i hvem av C-enhetene som havner i test- versus treningssettet, gi ustabile estimater for F1 klasse C.</w:t>
+        <w:t xml:space="preserve"> Den stratifiserte 80/20-delingen sikrer at klassefordelingen i testsett og treningssett er representativ for populasjonen. For klasse C (108 observasjoner i testsettet, 431 i treningssettet) er dette særlig viktig: uten stratifisering ville tilfeldig variasjon i hvem av C-enhetene som havner i test- versus treningssettet, gi ustabile estimater for F1 klasse C.</w:t>
       </w:r>
     </w:p>
     <w:p>
@@ -19786,55 +19786,43 @@
       </w:pPr>
       <w:r>
         <w:rPr/>
-        <w:t xml:space="preserve">Random Forest oppnår 83,8 % </w:t>
-      </w:r>
-      <w:r>
-        <w:rPr/>
-        <w:t>accuracy</w:t>
-      </w:r>
-      <w:r>
-        <w:rPr/>
-        <w:t xml:space="preserve"> mot </w:t>
-      </w:r>
-      <w:r>
-        <w:rPr/>
-        <w:t>Decision</w:t>
-      </w:r>
-      <w:r>
-        <w:rPr/>
-        <w:t xml:space="preserve"> </w:t>
-      </w:r>
-      <w:r>
-        <w:rPr/>
-        <w:t>Trees</w:t>
-      </w:r>
-      <w:r>
-        <w:rPr/>
-        <w:t xml:space="preserve"> 79,9 % og majority-baseline 62,4 %. Random Forest overgår </w:t>
-      </w:r>
-      <w:r>
-        <w:rPr/>
-        <w:t>Decision</w:t>
-      </w:r>
-      <w:r>
-        <w:rPr/>
-        <w:t xml:space="preserve"> </w:t>
-      </w:r>
-      <w:r>
-        <w:rPr/>
-        <w:t>Tree</w:t>
-      </w:r>
-      <w:r>
-        <w:rPr/>
-        <w:t xml:space="preserve"> på alle tre klasser, med særlig stor forbedring for klasse C (F1: 0,88 vs. 0,75). 80 %-kravet definert i prosjektplanen er oppfylt, og løftet over </w:t>
-      </w:r>
-      <w:r>
-        <w:rPr/>
-        <w:t>majority</w:t>
-      </w:r>
-      <w:r>
-        <w:rPr/>
-        <w:t>-baseline (+21,4 prosentpoeng) viser at modellen tilfører reell prediktiv kraft.</w:t>
+        <w:t>Random Forest oppnår 83,76 % accuracy mot Decision Trees 79,9 % og majority-baseline 62,4 %. Random Forest overgår Decision Tree på alle tre klasser, med særlig stor forbedring for klasse C (F1: 0,88 vs. 0,75). 80 %-kravet definert i prosjektplanen er oppfylt, og løftet over majority-baseline (+21,4 prosentpoeng) viser at modellen tilfører reell prediktiv kraft.</w:t>
+      </w:r>
+      <w:r>
+        <w:rPr/>
+      </w:r>
+      <w:r>
+        <w:rPr/>
+      </w:r>
+      <w:r>
+        <w:rPr/>
+      </w:r>
+      <w:r>
+        <w:rPr/>
+      </w:r>
+      <w:r>
+        <w:rPr/>
+      </w:r>
+      <w:r>
+        <w:rPr/>
+      </w:r>
+      <w:r>
+        <w:rPr/>
+      </w:r>
+      <w:r>
+        <w:rPr/>
+      </w:r>
+      <w:r>
+        <w:rPr/>
+      </w:r>
+      <w:r>
+        <w:rPr/>
+      </w:r>
+      <w:r>
+        <w:rPr/>
+      </w:r>
+      <w:r>
+        <w:rPr/>
       </w:r>
     </w:p>
     <w:p>

</xml_diff>